<commit_message>
feat: melhorado o quiz e a modelagem
</commit_message>
<xml_diff>
--- a/Contexto PI Individual.docx
+++ b/Contexto PI Individual.docx
@@ -4,7 +4,15 @@
   <w:body>
     <w:p>
       <w:r>
-        <w:t>Star wars – Kristhian Fortunato Wirthl 01261012</w:t>
+        <w:t xml:space="preserve">Star </w:t>
+      </w:r>
+      <w:proofErr w:type="spellStart"/>
+      <w:r>
+        <w:t>wars</w:t>
+      </w:r>
+      <w:proofErr w:type="spellEnd"/>
+      <w:r>
+        <w:t xml:space="preserve"> – Kristhian Fortunato Wirthl 01261012</w:t>
       </w:r>
     </w:p>
     <w:p/>
@@ -101,7 +109,15 @@
         <w:t xml:space="preserve">quando de repente algo prendeu muita a minha atenção, o fato de </w:t>
       </w:r>
       <w:r>
-        <w:t>Jar Jar Binks</w:t>
+        <w:t xml:space="preserve">Jar </w:t>
+      </w:r>
+      <w:proofErr w:type="spellStart"/>
+      <w:r>
+        <w:t>Jar</w:t>
+      </w:r>
+      <w:proofErr w:type="spellEnd"/>
+      <w:r>
+        <w:t xml:space="preserve"> Binks</w:t>
       </w:r>
       <w:r>
         <w:t xml:space="preserve">, um ser </w:t>
@@ -218,14 +234,30 @@
         <w:t>a ligação entre, filmes, séries, jogos, tudo do universo, por exemplo, um fala que acontece no filme X,</w:t>
       </w:r>
       <w:r>
-        <w:t xml:space="preserve"> ninguém entende o por que </w:t>
+        <w:t xml:space="preserve"> ninguém entende o </w:t>
+      </w:r>
+      <w:proofErr w:type="spellStart"/>
+      <w:r>
+        <w:t>por que</w:t>
+      </w:r>
+      <w:proofErr w:type="spellEnd"/>
+      <w:r>
+        <w:t xml:space="preserve"> </w:t>
       </w:r>
       <w:r>
         <w:lastRenderedPageBreak/>
         <w:t xml:space="preserve">daquilo ser dito naquele momento, mas se você assistir as séries, por exemplo, </w:t>
       </w:r>
       <w:r>
-        <w:t>aquela fala fará muito significado e explicará o porque tudo aconteceu da forma que aconteceu.</w:t>
+        <w:t xml:space="preserve">aquela fala fará muito significado e explicará o </w:t>
+      </w:r>
+      <w:proofErr w:type="spellStart"/>
+      <w:r>
+        <w:t>porque</w:t>
+      </w:r>
+      <w:proofErr w:type="spellEnd"/>
+      <w:r>
+        <w:t xml:space="preserve"> tudo aconteceu da forma que aconteceu.</w:t>
       </w:r>
     </w:p>
     <w:p>
@@ -409,6 +441,62 @@
       </w:r>
       <w:r>
         <w:t xml:space="preserve"> minha história com Star Wars.</w:t>
+      </w:r>
+    </w:p>
+    <w:p>
+      <w:pPr>
+        <w:jc w:val="both"/>
+      </w:pPr>
+    </w:p>
+    <w:p>
+      <w:pPr>
+        <w:jc w:val="both"/>
+      </w:pPr>
+    </w:p>
+    <w:p>
+      <w:pPr>
+        <w:jc w:val="both"/>
+      </w:pPr>
+      <w:r>
+        <w:t>Objetivos de Desenvolvimento Sustentáveis:</w:t>
+      </w:r>
+    </w:p>
+    <w:p>
+      <w:pPr>
+        <w:jc w:val="both"/>
+      </w:pPr>
+    </w:p>
+    <w:p>
+      <w:pPr>
+        <w:jc w:val="both"/>
+      </w:pPr>
+      <w:r>
+        <w:lastRenderedPageBreak/>
+        <w:t xml:space="preserve">No meu projeto pessoal sobre Star Wars, eu </w:t>
+      </w:r>
+      <w:r>
+        <w:t xml:space="preserve">conseguir identificar </w:t>
+      </w:r>
+      <w:r>
+        <w:t xml:space="preserve">o objetivo de número 12 (Consumo e Produção Responsáveis). No primeiro filme lançado (4 – Uma nova esperança), existe uma espécie de coletores, chamada </w:t>
+      </w:r>
+      <w:r>
+        <w:t>Jawas, eles são encontrados em Tatooine e basicamente eles são andarilhos, que coletam principalmente lixos eletrônicos</w:t>
+      </w:r>
+      <w:r>
+        <w:t xml:space="preserve"> no deserto, desmontam e criam coisas novas, para no final poder vender</w:t>
+      </w:r>
+      <w:r>
+        <w:t xml:space="preserve">, eles fazem uma reciclagem do deserto para sobrevivência, e por este motivo não se encontra facilmente lixo no deserto, </w:t>
+      </w:r>
+      <w:r>
+        <w:t xml:space="preserve">deixando assim de certa forma, o ambiente mais limpo, </w:t>
+      </w:r>
+      <w:r>
+        <w:t>criando uma reciclagem e movimentando o comércio</w:t>
+      </w:r>
+      <w:r>
+        <w:t>, eles são os salvadores do deserto.</w:t>
       </w:r>
     </w:p>
     <w:sectPr>

</xml_diff>